<commit_message>
fix(cv): drop six AI/ML keywords Krish can't defend
LangChain, LangGraph, AutoGen, CrewAI, Scikit-Learn and Locust are gone
from skillGroups. They were added in Aug 2026 after a recruiter rejected
the CV for missing AI/ML terms, but Krish had said "im not sure" about
the four agent frameworks and named k6 rather than Locust when asked
directly. His call, in his words: "these skills not needed for QA".

A searchable profile carrying undefendable frameworks generates inbound
he can't convert, which is worse than not surfacing for those searches at
all. Skills go 61 -> 55; the CV stays two pages and Playwright, Appium,
Selenium, SDET, RAG, Model Evaluation and PyTorch all still extract.

Regenerated public/ PDF and DOCX, and replaced the resume on his Indeed
profile — which had still been serving the July CV, so employers were
seeing the old four-page layout and only 28 parsed skills. Indeed now
reports 55, exact parity with resume.mjs.
</commit_message>
<xml_diff>
--- a/public/KRISH_PAVULURI_CV.docx
+++ b/public/KRISH_PAVULURI_CV.docx
@@ -44,7 +44,7 @@
         </w:rPr>
         <w:t xml:space="preserve">Montreal, QC  |  438-928-0928  |  </w:t>
       </w:r>
-      <w:hyperlink w:history="1" r:id="rId44koi5tpmor5nckjv5wlz">
+      <w:hyperlink w:history="1" r:id="rId4qua9yncremcyn7ifpmjn">
         <w:r>
           <w:rPr>
             <w:rStyle w:val="Hyperlink"/>
@@ -61,7 +61,7 @@
         </w:rPr>
         <w:t xml:space="preserve">  |  </w:t>
       </w:r>
-      <w:hyperlink w:history="1" r:id="rIdgp_rqwb93feulh6vswusc">
+      <w:hyperlink w:history="1" r:id="rId_glynpuyhnzakujvg75z8">
         <w:r>
           <w:rPr>
             <w:rStyle w:val="Hyperlink"/>
@@ -78,7 +78,7 @@
         </w:rPr>
         <w:t xml:space="preserve">  |  </w:t>
       </w:r>
-      <w:hyperlink w:history="1" r:id="rIdu-kvliuposl3rrh1lnzd2">
+      <w:hyperlink w:history="1" r:id="rId_qkyeuscpcyksglgrw5gh">
         <w:r>
           <w:rPr>
             <w:rStyle w:val="Hyperlink"/>
@@ -272,7 +272,7 @@
           <w:sz w:val="18"/>
           <w:szCs w:val="18"/>
         </w:rPr>
-        <w:t xml:space="preserve">Agentic AI · Multi-Agent Orchestration · MCP · Prompt Engineering · RAG · Embedding Pipelines · Vector Databases · Model Evaluation · OpenAI / LLMs · Ollama · HuggingFace Transformers · Claude Code · GitHub Copilot · LangChain · LangGraph · AutoGen · CrewAI</w:t>
+        <w:t xml:space="preserve">Agentic AI · Multi-Agent Orchestration · MCP · Prompt Engineering · RAG · Embedding Pipelines · Vector Databases · Model Evaluation · OpenAI / LLMs · Ollama · HuggingFace Transformers · Claude Code · GitHub Copilot</w:t>
       </w:r>
     </w:p>
     <w:p>
@@ -293,7 +293,7 @@
           <w:sz w:val="18"/>
           <w:szCs w:val="18"/>
         </w:rPr>
-        <w:t xml:space="preserve">PyTorch · TensorFlow · NLTK · BART · OpenCV · Scikit-Learn · MLOps / Model CI/CD · AI Governance &amp; Compliance</w:t>
+        <w:t xml:space="preserve">PyTorch · TensorFlow · NLTK · BART · OpenCV · MLOps / Model CI/CD · AI Governance &amp; Compliance</w:t>
       </w:r>
     </w:p>
     <w:p>
@@ -314,7 +314,7 @@
           <w:sz w:val="18"/>
           <w:szCs w:val="18"/>
         </w:rPr>
-        <w:t xml:space="preserve">JMeter · k6 · LoadRunner · Locust</w:t>
+        <w:t xml:space="preserve">JMeter · k6 · LoadRunner</w:t>
       </w:r>
     </w:p>
     <w:p>

</xml_diff>

<commit_message>
fix(cv): soften AI-strategy tenure claim from 4+ to 3+ years
Krish's call. The line lives in the long `summary` field, which the
current CV no longer renders — the PDF and DOCX both use the shorter
`headline` ("10+ years building automation frameworks"), so this text
was not reaching employers. Fixed at the source anyway, since the DOCX
generator falls back to `summary` when `headline` is absent.

Note this softens the claim without fully grounding it: his CV dates AI
work from Feb 2025, roughly 1.5 years, so 3+ still runs ahead of the
evidence. The nearest earlier anchor is a Bell bullet about hosting AI
helper services as APIs alongside the test grid.
</commit_message>
<xml_diff>
--- a/public/KRISH_PAVULURI_CV.docx
+++ b/public/KRISH_PAVULURI_CV.docx
@@ -44,7 +44,7 @@
         </w:rPr>
         <w:t xml:space="preserve">Montreal, QC  |  438-928-0928  |  </w:t>
       </w:r>
-      <w:hyperlink w:history="1" r:id="rId4qua9yncremcyn7ifpmjn">
+      <w:hyperlink w:history="1" r:id="rIdjkw19taz6ssfoynci0xg3">
         <w:r>
           <w:rPr>
             <w:rStyle w:val="Hyperlink"/>
@@ -61,7 +61,7 @@
         </w:rPr>
         <w:t xml:space="preserve">  |  </w:t>
       </w:r>
-      <w:hyperlink w:history="1" r:id="rId_glynpuyhnzakujvg75z8">
+      <w:hyperlink w:history="1" r:id="rIdxjk6rzyjv38hu87us-rlg">
         <w:r>
           <w:rPr>
             <w:rStyle w:val="Hyperlink"/>
@@ -78,7 +78,7 @@
         </w:rPr>
         <w:t xml:space="preserve">  |  </w:t>
       </w:r>
-      <w:hyperlink w:history="1" r:id="rId_qkyeuscpcyksglgrw5gh">
+      <w:hyperlink w:history="1" r:id="rIdlrtyuhpqbjkmduv7amnaf">
         <w:r>
           <w:rPr>
             <w:rStyle w:val="Hyperlink"/>

</xml_diff>

<commit_message>
feat(cv): add Helm to the canonical CI/CD & Cloud skills
Helm was surfacing only on the Orion variant, where it describes real work —
Helm charts pointing builds at Docker containers to run the Playwright suites.
It belongs in the canonical skill list so every tailored CV can score and
surface it, not just that one variant.

Added to the CI/CD & Cloud group next to Docker. skillNames derives from the
groups, so the tailoring pass picks it up automatically — confirmed with a
Kubernetes/Helm test JD, which now matches Helm alongside Docker and Playwright.

Verified: 2 pages, name extracts cleanly, Helm present in both PDF and DOCX,
56 skills total.
</commit_message>
<xml_diff>
--- a/public/KRISH_PAVULURI_CV.docx
+++ b/public/KRISH_PAVULURI_CV.docx
@@ -44,7 +44,7 @@
         </w:rPr>
         <w:t xml:space="preserve">Montreal, QC  |  438-928-0928  |  </w:t>
       </w:r>
-      <w:hyperlink w:history="1" r:id="rIdqiungw_nh4um_qrju3-ln">
+      <w:hyperlink w:history="1" r:id="rIdzswnu6y1qarlg00wsrcab">
         <w:r>
           <w:rPr>
             <w:rStyle w:val="Hyperlink"/>
@@ -61,7 +61,7 @@
         </w:rPr>
         <w:t xml:space="preserve">  |  </w:t>
       </w:r>
-      <w:hyperlink w:history="1" r:id="rIdoghskrwo7mlpxof2v1p6x">
+      <w:hyperlink w:history="1" r:id="rId6nvxvdatmnz2ygrucod8k">
         <w:r>
           <w:rPr>
             <w:rStyle w:val="Hyperlink"/>
@@ -78,7 +78,7 @@
         </w:rPr>
         <w:t xml:space="preserve">  |  </w:t>
       </w:r>
-      <w:hyperlink w:history="1" r:id="rId_lnh2jdhb1p8bwoepxeua">
+      <w:hyperlink w:history="1" r:id="rIdxgqj7iojik6xygfernsvx">
         <w:r>
           <w:rPr>
             <w:rStyle w:val="Hyperlink"/>
@@ -335,7 +335,7 @@
           <w:sz w:val="18"/>
           <w:szCs w:val="18"/>
         </w:rPr>
-        <w:t xml:space="preserve">Jenkins · GitHub Actions · GitLab CI · Azure DevOps · Docker · Ansible · Maven · Gradle · CI/CD · AWS · Azure · GCP · Azure OpenAI · AWS Bedrock · Vertex AI</w:t>
+        <w:t xml:space="preserve">Jenkins · GitHub Actions · GitLab CI · Azure DevOps · Docker · Helm · Ansible · Maven · Gradle · CI/CD · AWS · Azure · GCP · Azure OpenAI · AWS Bedrock · Vertex AI</w:t>
       </w:r>
     </w:p>
     <w:p>

</xml_diff>